<commit_message>
minor update on resume
</commit_message>
<xml_diff>
--- a/resume/Resume_Md-Arafat-Hossain.docx
+++ b/resume/Resume_Md-Arafat-Hossain.docx
@@ -83,16 +83,8 @@
           <w:rPr>
             <w:rStyle w:val="Hyperlink"/>
           </w:rPr>
-          <w:t>linkedin.com/in/</w:t>
+          <w:t>linkedin.com/in/iarafathsn</w:t>
         </w:r>
-        <w:proofErr w:type="spellStart"/>
-        <w:r>
-          <w:rPr>
-            <w:rStyle w:val="Hyperlink"/>
-          </w:rPr>
-          <w:t>iarafathsn</w:t>
-        </w:r>
-        <w:proofErr w:type="spellEnd"/>
       </w:hyperlink>
       <w:r>
         <w:rPr>
@@ -105,16 +97,8 @@
           <w:rPr>
             <w:rStyle w:val="Hyperlink"/>
           </w:rPr>
-          <w:t>github.com/</w:t>
+          <w:t>github.com/iarafathsn</w:t>
         </w:r>
-        <w:proofErr w:type="spellStart"/>
-        <w:r>
-          <w:rPr>
-            <w:rStyle w:val="Hyperlink"/>
-          </w:rPr>
-          <w:t>iarafathsn</w:t>
-        </w:r>
-        <w:proofErr w:type="spellEnd"/>
       </w:hyperlink>
     </w:p>
     <w:p>
@@ -304,25 +288,7 @@
           <w:sz w:val="20"/>
           <w:szCs w:val="20"/>
         </w:rPr>
-        <w:t xml:space="preserve">Own the Settings and </w:t>
-      </w:r>
-      <w:proofErr w:type="spellStart"/>
-      <w:r>
-        <w:rPr>
-          <w:color w:val="000000" w:themeColor="text1"/>
-          <w:sz w:val="20"/>
-          <w:szCs w:val="20"/>
-        </w:rPr>
-        <w:t>MapView</w:t>
-      </w:r>
-      <w:proofErr w:type="spellEnd"/>
-      <w:r>
-        <w:rPr>
-          <w:color w:val="000000" w:themeColor="text1"/>
-          <w:sz w:val="20"/>
-          <w:szCs w:val="20"/>
-        </w:rPr>
-        <w:t xml:space="preserve"> domains within SmartThings iOS, a leading IoT platform serving 62M+ active users worldwide.</w:t>
+        <w:t>Own the Settings and MapView domains within SmartThings iOS, a leading IoT platform serving 62M+ active users worldwide.</w:t>
       </w:r>
     </w:p>
     <w:p>
@@ -366,25 +332,7 @@
           <w:sz w:val="20"/>
           <w:szCs w:val="20"/>
         </w:rPr>
-        <w:t xml:space="preserve">Lead architecture and feature development for </w:t>
-      </w:r>
-      <w:proofErr w:type="spellStart"/>
-      <w:r>
-        <w:rPr>
-          <w:color w:val="000000" w:themeColor="text1"/>
-          <w:sz w:val="20"/>
-          <w:szCs w:val="20"/>
-        </w:rPr>
-        <w:t>MapView</w:t>
-      </w:r>
-      <w:proofErr w:type="spellEnd"/>
-      <w:r>
-        <w:rPr>
-          <w:color w:val="000000" w:themeColor="text1"/>
-          <w:sz w:val="20"/>
-          <w:szCs w:val="20"/>
-        </w:rPr>
-        <w:t xml:space="preserve">, integrating new device experiences including TVs, lighting systems, sensors, and </w:t>
+        <w:t xml:space="preserve">Lead architecture and feature development for MapView, integrating new device experiences including TVs, lighting systems, sensors, and </w:t>
       </w:r>
       <w:r>
         <w:rPr>
@@ -438,25 +386,7 @@
           <w:sz w:val="20"/>
           <w:szCs w:val="20"/>
         </w:rPr>
-        <w:t xml:space="preserve">Migrate application modules from </w:t>
-      </w:r>
-      <w:proofErr w:type="spellStart"/>
-      <w:r>
-        <w:rPr>
-          <w:color w:val="000000" w:themeColor="text1"/>
-          <w:sz w:val="20"/>
-          <w:szCs w:val="20"/>
-        </w:rPr>
-        <w:t>ReactiveSwift</w:t>
-      </w:r>
-      <w:proofErr w:type="spellEnd"/>
-      <w:r>
-        <w:rPr>
-          <w:color w:val="000000" w:themeColor="text1"/>
-          <w:sz w:val="20"/>
-          <w:szCs w:val="20"/>
-        </w:rPr>
-        <w:t xml:space="preserve"> to Combine, modernizing the reactive architecture and improving maintainability.</w:t>
+        <w:t>Migrate application modules from ReactiveSwift to Combine, modernizing the reactive architecture and improving maintainability.</w:t>
       </w:r>
     </w:p>
     <w:p>
@@ -522,25 +452,7 @@
           <w:sz w:val="20"/>
           <w:szCs w:val="20"/>
         </w:rPr>
-        <w:t xml:space="preserve">Lead application-side integration of a new rendering architecture for SmartThings </w:t>
-      </w:r>
-      <w:proofErr w:type="spellStart"/>
-      <w:r>
-        <w:rPr>
-          <w:color w:val="000000" w:themeColor="text1"/>
-          <w:sz w:val="20"/>
-          <w:szCs w:val="20"/>
-        </w:rPr>
-        <w:t>MapView</w:t>
-      </w:r>
-      <w:proofErr w:type="spellEnd"/>
-      <w:r>
-        <w:rPr>
-          <w:color w:val="000000" w:themeColor="text1"/>
-          <w:sz w:val="20"/>
-          <w:szCs w:val="20"/>
-        </w:rPr>
-        <w:t>, driving migration from Unity to Godot Engine and defining integration strategy, platform interfaces, and rollout approach.</w:t>
+        <w:t>Lead application-side integration of a new rendering architecture for SmartThings MapView, driving migration from Unity to Godot Engine and defining integration strategy, platform interfaces, and rollout approach.</w:t>
       </w:r>
     </w:p>
     <w:p>
@@ -562,43 +474,7 @@
           <w:sz w:val="20"/>
           <w:szCs w:val="20"/>
         </w:rPr>
-        <w:t xml:space="preserve">Contribute to </w:t>
-      </w:r>
-      <w:proofErr w:type="spellStart"/>
-      <w:r>
-        <w:rPr>
-          <w:color w:val="000000" w:themeColor="text1"/>
-          <w:sz w:val="20"/>
-          <w:szCs w:val="20"/>
-        </w:rPr>
-        <w:t>SwiftGodotKit</w:t>
-      </w:r>
-      <w:proofErr w:type="spellEnd"/>
-      <w:r>
-        <w:rPr>
-          <w:color w:val="000000" w:themeColor="text1"/>
-          <w:sz w:val="20"/>
-          <w:szCs w:val="20"/>
-        </w:rPr>
-        <w:t xml:space="preserve"> and related projects supporting native Swift ↔ Godot interoperability for SmartThings </w:t>
-      </w:r>
-      <w:proofErr w:type="spellStart"/>
-      <w:r>
-        <w:rPr>
-          <w:color w:val="000000" w:themeColor="text1"/>
-          <w:sz w:val="20"/>
-          <w:szCs w:val="20"/>
-        </w:rPr>
-        <w:t>MapView</w:t>
-      </w:r>
-      <w:proofErr w:type="spellEnd"/>
-      <w:r>
-        <w:rPr>
-          <w:color w:val="000000" w:themeColor="text1"/>
-          <w:sz w:val="20"/>
-          <w:szCs w:val="20"/>
-        </w:rPr>
-        <w:t xml:space="preserve"> integration.</w:t>
+        <w:t>Contribute to SwiftGodotKit and related projects supporting native Swift ↔ Godot interoperability for SmartThings MapView integration.</w:t>
       </w:r>
     </w:p>
     <w:p>
@@ -650,27 +526,7 @@
           <w:color w:val="000000" w:themeColor="text1"/>
           <w:sz w:val="22"/>
         </w:rPr>
-        <w:t xml:space="preserve">Samsung </w:t>
-      </w:r>
-      <w:proofErr w:type="spellStart"/>
-      <w:r>
-        <w:rPr>
-          <w:b/>
-          <w:bCs/>
-          <w:color w:val="000000" w:themeColor="text1"/>
-          <w:sz w:val="22"/>
-        </w:rPr>
-        <w:t>DeX</w:t>
-      </w:r>
-      <w:proofErr w:type="spellEnd"/>
-      <w:r>
-        <w:rPr>
-          <w:b/>
-          <w:bCs/>
-          <w:color w:val="000000" w:themeColor="text1"/>
-          <w:sz w:val="22"/>
-        </w:rPr>
-        <w:t xml:space="preserve"> for PC (2019 – 2023)</w:t>
+        <w:t>Samsung DeX for PC (2019 – 2023)</w:t>
       </w:r>
     </w:p>
     <w:p>
@@ -708,25 +564,7 @@
           <w:sz w:val="20"/>
           <w:szCs w:val="20"/>
         </w:rPr>
-        <w:t xml:space="preserve">Led architecture and development of Samsung </w:t>
-      </w:r>
-      <w:proofErr w:type="spellStart"/>
-      <w:r>
-        <w:rPr>
-          <w:color w:val="000000" w:themeColor="text1"/>
-          <w:sz w:val="20"/>
-          <w:szCs w:val="20"/>
-        </w:rPr>
-        <w:t>DeX</w:t>
-      </w:r>
-      <w:proofErr w:type="spellEnd"/>
-      <w:r>
-        <w:rPr>
-          <w:color w:val="000000" w:themeColor="text1"/>
-          <w:sz w:val="20"/>
-          <w:szCs w:val="20"/>
-        </w:rPr>
-        <w:t xml:space="preserve"> for macOS, contributing to a platform with 7M+ downloads and 750K+ monthly active users.</w:t>
+        <w:t>Led architecture and development of Samsung DeX for macOS, contributing to a platform with 7M+ downloads and 750K+ monthly active users.</w:t>
       </w:r>
     </w:p>
     <w:p>
@@ -985,25 +823,7 @@
           <w:szCs w:val="20"/>
         </w:rPr>
         <w:lastRenderedPageBreak/>
-        <w:t xml:space="preserve">Contributed to the open-source </w:t>
-      </w:r>
-      <w:proofErr w:type="spellStart"/>
-      <w:r>
-        <w:rPr>
-          <w:color w:val="000000" w:themeColor="text1"/>
-          <w:sz w:val="20"/>
-          <w:szCs w:val="20"/>
-        </w:rPr>
-        <w:t>IoTivity</w:t>
-      </w:r>
-      <w:proofErr w:type="spellEnd"/>
-      <w:r>
-        <w:rPr>
-          <w:color w:val="000000" w:themeColor="text1"/>
-          <w:sz w:val="20"/>
-          <w:szCs w:val="20"/>
-        </w:rPr>
-        <w:t xml:space="preserve"> framework, implementing OCF-compliant APIs and interoperability features for connected-device ecosystems.</w:t>
+        <w:t>Contributed to the open-source IoTivity framework, implementing OCF-compliant APIs and interoperability features for connected-device ecosystems.</w:t>
       </w:r>
     </w:p>
     <w:p>
@@ -1164,7 +984,6 @@
         <w:t xml:space="preserve">Developed 8+ iOS applications using Objective-C and </w:t>
       </w:r>
       <w:hyperlink r:id="rId14" w:history="1">
-        <w:proofErr w:type="spellStart"/>
         <w:r>
           <w:rPr>
             <w:rStyle w:val="Hyperlink"/>
@@ -1173,7 +992,6 @@
           </w:rPr>
           <w:t>GPUImage</w:t>
         </w:r>
-        <w:proofErr w:type="spellEnd"/>
       </w:hyperlink>
       <w:r>
         <w:rPr>
@@ -1225,25 +1043,7 @@
           <w:sz w:val="20"/>
           <w:szCs w:val="20"/>
         </w:rPr>
-        <w:t xml:space="preserve">Delivered </w:t>
-      </w:r>
-      <w:proofErr w:type="spellStart"/>
-      <w:r>
-        <w:rPr>
-          <w:color w:val="000000" w:themeColor="text1"/>
-          <w:sz w:val="20"/>
-          <w:szCs w:val="20"/>
-        </w:rPr>
-        <w:t>MultiShot</w:t>
-      </w:r>
-      <w:proofErr w:type="spellEnd"/>
-      <w:r>
-        <w:rPr>
-          <w:color w:val="000000" w:themeColor="text1"/>
-          <w:sz w:val="20"/>
-          <w:szCs w:val="20"/>
-        </w:rPr>
-        <w:t xml:space="preserve"> Cam, one of the company’s highest-performing applications.</w:t>
+        <w:t>Delivered MultiShot Cam, one of the company’s highest-performing applications.</w:t>
       </w:r>
     </w:p>
     <w:p>
@@ -1345,52 +1145,110 @@
           <w:color w:val="000000" w:themeColor="text1"/>
         </w:rPr>
       </w:pPr>
-      <w:proofErr w:type="spellStart"/>
       <w:r>
         <w:rPr>
           <w:bCs/>
           <w:iCs/>
           <w:color w:val="000000" w:themeColor="text1"/>
         </w:rPr>
-        <w:t>UIKit</w:t>
-      </w:r>
-      <w:proofErr w:type="spellEnd"/>
-      <w:r>
+        <w:t>UIKit, SwiftUI, Combine, Swift Concurrency, Grand Central Dispatch (GCD), XCTest</w:t>
+      </w:r>
+    </w:p>
+    <w:p>
+      <w:pPr>
+        <w:pStyle w:val="List"/>
+        <w:rPr>
+          <w:b/>
+          <w:iCs/>
+          <w:color w:val="000000" w:themeColor="text1"/>
+          <w:sz w:val="10"/>
+          <w:szCs w:val="10"/>
+        </w:rPr>
+      </w:pPr>
+    </w:p>
+    <w:p>
+      <w:pPr>
+        <w:pStyle w:val="List"/>
+        <w:rPr>
+          <w:b/>
+          <w:iCs/>
+          <w:color w:val="000000" w:themeColor="text1"/>
+        </w:rPr>
+      </w:pPr>
+      <w:r>
+        <w:rPr>
+          <w:b/>
+          <w:iCs/>
+          <w:color w:val="000000" w:themeColor="text1"/>
+        </w:rPr>
+        <w:t>Architecture &amp; Engineering</w:t>
+      </w:r>
+    </w:p>
+    <w:p>
+      <w:pPr>
+        <w:pStyle w:val="List"/>
         <w:rPr>
           <w:bCs/>
           <w:iCs/>
           <w:color w:val="000000" w:themeColor="text1"/>
         </w:rPr>
-        <w:t xml:space="preserve">, </w:t>
-      </w:r>
-      <w:proofErr w:type="spellStart"/>
+      </w:pPr>
       <w:r>
         <w:rPr>
           <w:bCs/>
           <w:iCs/>
           <w:color w:val="000000" w:themeColor="text1"/>
         </w:rPr>
-        <w:t>SwiftUI</w:t>
-      </w:r>
-      <w:proofErr w:type="spellEnd"/>
-      <w:r>
+        <w:t>MVVM, MVVM-C, Mobile Architecture, Mobile Platform Engineering, Modular Architecture, Dependency Injection, State Management</w:t>
+      </w:r>
+    </w:p>
+    <w:p>
+      <w:pPr>
+        <w:pStyle w:val="List"/>
+        <w:rPr>
+          <w:b/>
+          <w:iCs/>
+          <w:color w:val="000000" w:themeColor="text1"/>
+          <w:sz w:val="10"/>
+          <w:szCs w:val="10"/>
+        </w:rPr>
+      </w:pPr>
+    </w:p>
+    <w:p>
+      <w:pPr>
+        <w:pStyle w:val="List"/>
+        <w:rPr>
+          <w:b/>
+          <w:iCs/>
+          <w:color w:val="000000" w:themeColor="text1"/>
+        </w:rPr>
+      </w:pPr>
+      <w:r>
+        <w:rPr>
+          <w:b/>
+          <w:iCs/>
+          <w:color w:val="000000" w:themeColor="text1"/>
+        </w:rPr>
+        <w:t>Networking &amp; Integration</w:t>
+      </w:r>
+    </w:p>
+    <w:p>
+      <w:pPr>
+        <w:pStyle w:val="List"/>
         <w:rPr>
           <w:bCs/>
           <w:iCs/>
           <w:color w:val="000000" w:themeColor="text1"/>
         </w:rPr>
-        <w:t xml:space="preserve">, Combine, Swift Concurrency, Grand Central Dispatch (GCD), </w:t>
-      </w:r>
-      <w:proofErr w:type="spellStart"/>
+      </w:pPr>
       <w:r>
         <w:rPr>
           <w:bCs/>
           <w:iCs/>
           <w:color w:val="000000" w:themeColor="text1"/>
         </w:rPr>
-        <w:t>XCTest</w:t>
-      </w:r>
-      <w:proofErr w:type="spellEnd"/>
+        <w:t>REST APIs, URLSession, Firebase, Analytics Integration</w:t>
+      </w:r>
     </w:p>
     <w:p>
       <w:pPr>
@@ -1419,7 +1277,7 @@
           <w:iCs/>
           <w:color w:val="000000" w:themeColor="text1"/>
         </w:rPr>
-        <w:t>Architecture &amp; Engineering</w:t>
+        <w:t>Tools &amp; DevOps</w:t>
       </w:r>
     </w:p>
     <w:p>
@@ -1437,139 +1295,7 @@
           <w:iCs/>
           <w:color w:val="000000" w:themeColor="text1"/>
         </w:rPr>
-        <w:t>MVVM, MVVM-C, Mobile Architecture, Mobile Platform Engineering, Modular Architecture, Dependency Injection, State Management</w:t>
-      </w:r>
-    </w:p>
-    <w:p>
-      <w:pPr>
-        <w:pStyle w:val="List"/>
-        <w:rPr>
-          <w:b/>
-          <w:iCs/>
-          <w:color w:val="000000" w:themeColor="text1"/>
-          <w:sz w:val="10"/>
-          <w:szCs w:val="10"/>
-        </w:rPr>
-      </w:pPr>
-    </w:p>
-    <w:p>
-      <w:pPr>
-        <w:pStyle w:val="List"/>
-        <w:rPr>
-          <w:b/>
-          <w:iCs/>
-          <w:color w:val="000000" w:themeColor="text1"/>
-        </w:rPr>
-      </w:pPr>
-      <w:r>
-        <w:rPr>
-          <w:b/>
-          <w:iCs/>
-          <w:color w:val="000000" w:themeColor="text1"/>
-        </w:rPr>
-        <w:t>Networking &amp; Integration</w:t>
-      </w:r>
-    </w:p>
-    <w:p>
-      <w:pPr>
-        <w:pStyle w:val="List"/>
-        <w:rPr>
-          <w:bCs/>
-          <w:iCs/>
-          <w:color w:val="000000" w:themeColor="text1"/>
-        </w:rPr>
-      </w:pPr>
-      <w:r>
-        <w:rPr>
-          <w:bCs/>
-          <w:iCs/>
-          <w:color w:val="000000" w:themeColor="text1"/>
-        </w:rPr>
-        <w:t xml:space="preserve">REST APIs, </w:t>
-      </w:r>
-      <w:proofErr w:type="spellStart"/>
-      <w:r>
-        <w:rPr>
-          <w:bCs/>
-          <w:iCs/>
-          <w:color w:val="000000" w:themeColor="text1"/>
-        </w:rPr>
-        <w:t>URLSession</w:t>
-      </w:r>
-      <w:proofErr w:type="spellEnd"/>
-      <w:r>
-        <w:rPr>
-          <w:bCs/>
-          <w:iCs/>
-          <w:color w:val="000000" w:themeColor="text1"/>
-        </w:rPr>
-        <w:t>, Firebase, Analytics Integration</w:t>
-      </w:r>
-    </w:p>
-    <w:p>
-      <w:pPr>
-        <w:pStyle w:val="List"/>
-        <w:rPr>
-          <w:b/>
-          <w:iCs/>
-          <w:color w:val="000000" w:themeColor="text1"/>
-          <w:sz w:val="10"/>
-          <w:szCs w:val="10"/>
-        </w:rPr>
-      </w:pPr>
-    </w:p>
-    <w:p>
-      <w:pPr>
-        <w:pStyle w:val="List"/>
-        <w:rPr>
-          <w:b/>
-          <w:iCs/>
-          <w:color w:val="000000" w:themeColor="text1"/>
-        </w:rPr>
-      </w:pPr>
-      <w:r>
-        <w:rPr>
-          <w:b/>
-          <w:iCs/>
-          <w:color w:val="000000" w:themeColor="text1"/>
-        </w:rPr>
-        <w:t>Tools &amp; DevOps</w:t>
-      </w:r>
-    </w:p>
-    <w:p>
-      <w:pPr>
-        <w:pStyle w:val="List"/>
-        <w:rPr>
-          <w:bCs/>
-          <w:iCs/>
-          <w:color w:val="000000" w:themeColor="text1"/>
-        </w:rPr>
-      </w:pPr>
-      <w:r>
-        <w:rPr>
-          <w:bCs/>
-          <w:iCs/>
-          <w:color w:val="000000" w:themeColor="text1"/>
-        </w:rPr>
-        <w:t xml:space="preserve">Git, GitHub, GitHub Actions, Jenkins, Swift Package Manager (SPM), </w:t>
-      </w:r>
-      <w:proofErr w:type="spellStart"/>
-      <w:r>
-        <w:rPr>
-          <w:bCs/>
-          <w:iCs/>
-          <w:color w:val="000000" w:themeColor="text1"/>
-        </w:rPr>
-        <w:t>CocoaPods</w:t>
-      </w:r>
-      <w:proofErr w:type="spellEnd"/>
-      <w:r>
-        <w:rPr>
-          <w:bCs/>
-          <w:iCs/>
-          <w:color w:val="000000" w:themeColor="text1"/>
-        </w:rPr>
-        <w:t>, TestFlight</w:t>
+        <w:t>Git, GitHub, GitHub Actions, Jenkins, Swift Package Manager (SPM), CocoaPods, TestFlight</w:t>
       </w:r>
     </w:p>
     <w:p>
@@ -1645,7 +1371,7 @@
         <w:rPr>
           <w:color w:val="000000" w:themeColor="text1"/>
         </w:rPr>
-        <w:t>SELECTED ACHIEVEMENTS</w:t>
+        <w:t>ACHIEVEMENTS</w:t>
       </w:r>
     </w:p>
     <w:p>
@@ -1667,25 +1393,7 @@
           <w:sz w:val="20"/>
           <w:szCs w:val="20"/>
         </w:rPr>
-        <w:t xml:space="preserve">Owner of key SmartThings iOS domains including Settings and </w:t>
-      </w:r>
-      <w:proofErr w:type="spellStart"/>
-      <w:r>
-        <w:rPr>
-          <w:color w:val="000000" w:themeColor="text1"/>
-          <w:sz w:val="20"/>
-          <w:szCs w:val="20"/>
-        </w:rPr>
-        <w:t>MapView</w:t>
-      </w:r>
-      <w:proofErr w:type="spellEnd"/>
-      <w:r>
-        <w:rPr>
-          <w:color w:val="000000" w:themeColor="text1"/>
-          <w:sz w:val="20"/>
-          <w:szCs w:val="20"/>
-        </w:rPr>
-        <w:t xml:space="preserve"> within a platform serving 62M+ active users worldwide.</w:t>
+        <w:t>Owner of key SmartThings iOS domains including Settings and MapView within a platform serving 62M+ active users worldwide.</w:t>
       </w:r>
     </w:p>
     <w:p>
@@ -1707,25 +1415,7 @@
           <w:sz w:val="20"/>
           <w:szCs w:val="20"/>
         </w:rPr>
-        <w:t xml:space="preserve">Technical Lead for Samsung </w:t>
-      </w:r>
-      <w:proofErr w:type="spellStart"/>
-      <w:r>
-        <w:rPr>
-          <w:color w:val="000000" w:themeColor="text1"/>
-          <w:sz w:val="20"/>
-          <w:szCs w:val="20"/>
-        </w:rPr>
-        <w:t>DeX</w:t>
-      </w:r>
-      <w:proofErr w:type="spellEnd"/>
-      <w:r>
-        <w:rPr>
-          <w:color w:val="000000" w:themeColor="text1"/>
-          <w:sz w:val="20"/>
-          <w:szCs w:val="20"/>
-        </w:rPr>
-        <w:t xml:space="preserve"> macOS platform supporting 7M+ downloads and 750K+ monthly active users.</w:t>
+        <w:t>Technical Lead for Samsung DeX macOS platform supporting 7M+ downloads and 750K+ monthly active users.</w:t>
       </w:r>
     </w:p>
     <w:p>
@@ -1747,25 +1437,7 @@
           <w:sz w:val="20"/>
           <w:szCs w:val="20"/>
         </w:rPr>
-        <w:t xml:space="preserve">Led application-side architecture and integration strategy for SmartThings </w:t>
-      </w:r>
-      <w:proofErr w:type="spellStart"/>
-      <w:r>
-        <w:rPr>
-          <w:color w:val="000000" w:themeColor="text1"/>
-          <w:sz w:val="20"/>
-          <w:szCs w:val="20"/>
-        </w:rPr>
-        <w:t>MapView</w:t>
-      </w:r>
-      <w:proofErr w:type="spellEnd"/>
-      <w:r>
-        <w:rPr>
-          <w:color w:val="000000" w:themeColor="text1"/>
-          <w:sz w:val="20"/>
-          <w:szCs w:val="20"/>
-        </w:rPr>
-        <w:t xml:space="preserve"> migration from Unity to Godot Engine.</w:t>
+        <w:t>Led application-side architecture and integration strategy for SmartThings MapView migration from Unity to Godot Engine.</w:t>
       </w:r>
     </w:p>
     <w:p>
@@ -1862,19 +1534,11 @@
           <w:sz w:val="22"/>
         </w:rPr>
       </w:pPr>
-      <w:proofErr w:type="spellStart"/>
-      <w:r>
-        <w:rPr>
-          <w:color w:val="000000" w:themeColor="text1"/>
-        </w:rPr>
-        <w:t>Rajshahi</w:t>
-      </w:r>
-      <w:proofErr w:type="spellEnd"/>
-      <w:r>
-        <w:rPr>
-          <w:color w:val="000000" w:themeColor="text1"/>
-        </w:rPr>
-        <w:t xml:space="preserve"> University of Engineering &amp; Technology (RUET) | 2008 – 2012</w:t>
+      <w:r>
+        <w:rPr>
+          <w:color w:val="000000" w:themeColor="text1"/>
+        </w:rPr>
+        <w:t>Rajshahi University of Engineering &amp; Technology (RUET) | 2008 – 2012</w:t>
       </w:r>
     </w:p>
     <w:sectPr>
@@ -6462,15 +6126,6 @@
 </file>
 
 <file path=customXml/item1.xml><?xml version="1.0" encoding="utf-8"?>
-<?mso-contentType ?>
-<FormTemplates xmlns="http://schemas.microsoft.com/sharepoint/v3/contenttype/forms">
-  <Display>DocumentLibraryForm</Display>
-  <Edit>DocumentLibraryForm</Edit>
-  <New>DocumentLibraryForm</New>
-</FormTemplates>
-</file>
-
-<file path=customXml/item2.xml><?xml version="1.0" encoding="utf-8"?>
 <p:properties xmlns:p="http://schemas.microsoft.com/office/2006/metadata/properties" xmlns:xsi="http://www.w3.org/2001/XMLSchema-instance" xmlns:pc="http://schemas.microsoft.com/office/infopath/2007/PartnerControls">
   <documentManagement>
     <_ip_UnifiedCompliancePolicyUIAction xmlns="http://schemas.microsoft.com/sharepoint/v3" xsi:nil="true"/>
@@ -6497,7 +6152,20 @@
 </p:properties>
 </file>
 
+<file path=customXml/item2.xml><?xml version="1.0" encoding="utf-8"?>
+<?mso-contentType ?>
+<FormTemplates xmlns="http://schemas.microsoft.com/sharepoint/v3/contenttype/forms">
+  <Display>DocumentLibraryForm</Display>
+  <Edit>DocumentLibraryForm</Edit>
+  <New>DocumentLibraryForm</New>
+</FormTemplates>
+</file>
+
 <file path=customXml/item3.xml><?xml version="1.0" encoding="utf-8"?>
+<b:Sources xmlns:b="http://schemas.openxmlformats.org/officeDocument/2006/bibliography" xmlns="http://schemas.openxmlformats.org/officeDocument/2006/bibliography" SelectedStyle="\APASixthEditionOfficeOnline.xsl" StyleName="APA" Version="6"/>
+</file>
+
+<file path=customXml/item4.xml><?xml version="1.0" encoding="utf-8"?>
 <ct:contentTypeSchema xmlns:ct="http://schemas.microsoft.com/office/2006/metadata/contentType" xmlns:ma="http://schemas.microsoft.com/office/2006/metadata/properties/metaAttributes" ct:_="" ma:_="" ma:contentTypeName="Document" ma:contentTypeID="0x01010079F111ED35F8CC479449609E8A0923A6" ma:contentTypeVersion="30" ma:contentTypeDescription="Create a new document." ma:contentTypeScope="" ma:versionID="cec0622158e8f13124e9e8fd4de31bd1">
   <xsd:schema xmlns:xsd="http://www.w3.org/2001/XMLSchema" xmlns:xs="http://www.w3.org/2001/XMLSchema" xmlns:p="http://schemas.microsoft.com/office/2006/metadata/properties" xmlns:ns1="http://schemas.microsoft.com/sharepoint/v3" xmlns:ns2="71af3243-3dd4-4a8d-8c0d-dd76da1f02a5" xmlns:ns3="16c05727-aa75-4e4a-9b5f-8a80a1165891" xmlns:ns4="230e9df3-be65-4c73-a93b-d1236ebd677e" targetNamespace="http://schemas.microsoft.com/office/2006/metadata/properties" ma:root="true" ma:fieldsID="3b52f30ab005d15df08657af532e6e38" ns1:_="" ns2:_="" ns3:_="" ns4:_="">
     <xsd:import namespace="http://schemas.microsoft.com/sharepoint/v3"/>
@@ -6815,19 +6483,7 @@
 </ct:contentTypeSchema>
 </file>
 
-<file path=customXml/item4.xml><?xml version="1.0" encoding="utf-8"?>
-<b:Sources xmlns:b="http://schemas.openxmlformats.org/officeDocument/2006/bibliography" xmlns="http://schemas.openxmlformats.org/officeDocument/2006/bibliography" SelectedStyle="\APASixthEditionOfficeOnline.xsl" StyleName="APA" Version="6"/>
-</file>
-
 <file path=customXml/itemProps1.xml><?xml version="1.0" encoding="utf-8"?>
-<ds:datastoreItem xmlns:ds="http://schemas.openxmlformats.org/officeDocument/2006/customXml" ds:itemID="{F8158BE5-FF4A-47EA-ABCC-F2FC8C69734F}">
-  <ds:schemaRefs>
-    <ds:schemaRef ds:uri="http://schemas.microsoft.com/sharepoint/v3/contenttype/forms"/>
-  </ds:schemaRefs>
-</ds:datastoreItem>
-</file>
-
-<file path=customXml/itemProps2.xml><?xml version="1.0" encoding="utf-8"?>
 <ds:datastoreItem xmlns:ds="http://schemas.openxmlformats.org/officeDocument/2006/customXml" ds:itemID="{2FA1C4FC-8415-4BF3-9F42-41DE68C426A1}">
   <ds:schemaRefs>
     <ds:schemaRef ds:uri="http://schemas.microsoft.com/office/2006/metadata/properties"/>
@@ -6840,7 +6496,23 @@
 </ds:datastoreItem>
 </file>
 
+<file path=customXml/itemProps2.xml><?xml version="1.0" encoding="utf-8"?>
+<ds:datastoreItem xmlns:ds="http://schemas.openxmlformats.org/officeDocument/2006/customXml" ds:itemID="{F8158BE5-FF4A-47EA-ABCC-F2FC8C69734F}">
+  <ds:schemaRefs>
+    <ds:schemaRef ds:uri="http://schemas.microsoft.com/sharepoint/v3/contenttype/forms"/>
+  </ds:schemaRefs>
+</ds:datastoreItem>
+</file>
+
 <file path=customXml/itemProps3.xml><?xml version="1.0" encoding="utf-8"?>
+<ds:datastoreItem xmlns:ds="http://schemas.openxmlformats.org/officeDocument/2006/customXml" ds:itemID="{673513B2-79CE-4C66-ACE4-3D67382244F7}">
+  <ds:schemaRefs>
+    <ds:schemaRef ds:uri="http://schemas.openxmlformats.org/officeDocument/2006/bibliography"/>
+  </ds:schemaRefs>
+</ds:datastoreItem>
+</file>
+
+<file path=customXml/itemProps4.xml><?xml version="1.0" encoding="utf-8"?>
 <ds:datastoreItem xmlns:ds="http://schemas.openxmlformats.org/officeDocument/2006/customXml" ds:itemID="{E334ADCA-0391-45BE-A0B8-AA9AA9016254}">
   <ds:schemaRefs>
     <ds:schemaRef ds:uri="http://schemas.microsoft.com/office/2006/metadata/contentType"/>
@@ -6861,14 +6533,6 @@
 </ds:datastoreItem>
 </file>
 
-<file path=customXml/itemProps4.xml><?xml version="1.0" encoding="utf-8"?>
-<ds:datastoreItem xmlns:ds="http://schemas.openxmlformats.org/officeDocument/2006/customXml" ds:itemID="{673513B2-79CE-4C66-ACE4-3D67382244F7}">
-  <ds:schemaRefs>
-    <ds:schemaRef ds:uri="http://schemas.openxmlformats.org/officeDocument/2006/bibliography"/>
-  </ds:schemaRefs>
-</ds:datastoreItem>
-</file>
-
 <file path=docMetadata/LabelInfo.xml><?xml version="1.0" encoding="utf-8"?>
 <clbl:labelList xmlns:clbl="http://schemas.microsoft.com/office/2020/mipLabelMetadata"/>
 </file>
</xml_diff>